<commit_message>
docs: remove privacy questions from speech and offline exports
</commit_message>
<xml_diff>
--- a/docs/exports/CounselorBot-KTH-discorso-EN.docx
+++ b/docs/exports/CounselorBot-KTH-discorso-EN.docx
@@ -371,11 +371,6 @@
     </w:p>
     <w:p>
       <w:r>
-        <w:t>We therefore need clear answers to three questions: what do we save, who can read it, and what information is shared outside the university? Students also need to understand this when deciding what to share.</w:t>
-      </w:r>
-    </w:p>
-    <w:p>
-      <w:r>
         <w:t>In the future, we could explore running both the application and the AI model on the student’s own computer. We have not explored this option yet.</w:t>
       </w:r>
     </w:p>

</xml_diff>